<commit_message>
fix: fixed cart test errors
</commit_message>
<xml_diff>
--- a/TestCaseScenario/TestCaseScenerioVer2.docx
+++ b/TestCaseScenario/TestCaseScenerioVer2.docx
@@ -17,13 +17,16 @@
           <w:sz w:val="32"/>
           <w:szCs w:val="32"/>
         </w:rPr>
-        <w:t>Rozbudowane Test Case – pantuniestal.com</w:t>
+        <w:t>Test Case – pantuniestal.com</w:t>
       </w:r>
     </w:p>
     <w:p/>
     <w:p>
       <w:r>
-        <w:t>ID: TC_ECOMMERCE_CART_ADD_PRODUCT_FROM_CATEGORY_LIST_UPDATE_CART_ICON_AND_CART_CONTENT_001</w:t>
+        <w:t xml:space="preserve">ID: </w:t>
+      </w:r>
+      <w:r>
+        <w:t>TC_CART_ADD_PRODUCT_CATEGORY_001</w:t>
       </w:r>
     </w:p>
     <w:p>
@@ -152,7 +155,10 @@
     </w:p>
     <w:p>
       <w:r>
-        <w:t>ID: TC_ECOMMERCE_CART_ADD_SAME_PRODUCT_MULTIPLE_TIMES_VERIFY_QUANTITY_INCREMENT_IN_CART_002</w:t>
+        <w:t xml:space="preserve">ID: </w:t>
+      </w:r>
+      <w:r>
+        <w:t>TC_CART_ADD_SAME_PRODUCT_QTY_INC_002</w:t>
       </w:r>
     </w:p>
     <w:p>
@@ -256,20 +262,23 @@
         <w:rPr>
           <w:lang w:val="pl-PL"/>
         </w:rPr>
+        <w:t>Oczekiwany wynik: W koszyku zwiększa się ilość produktu lub pojawia się wpis z większą liczbą sztuk.</w:t>
+      </w:r>
+    </w:p>
+    <w:p>
+      <w:pPr>
+        <w:rPr>
+          <w:lang w:val="pl-PL"/>
+        </w:rPr>
+      </w:pPr>
+    </w:p>
+    <w:p>
+      <w:r>
         <w:lastRenderedPageBreak/>
-        <w:t>Oczekiwany wynik: W koszyku zwiększa się ilość produktu lub pojawia się wpis z większą liczbą sztuk.</w:t>
-      </w:r>
-    </w:p>
-    <w:p>
-      <w:pPr>
-        <w:rPr>
-          <w:lang w:val="pl-PL"/>
-        </w:rPr>
-      </w:pPr>
-    </w:p>
-    <w:p>
-      <w:r>
-        <w:t>ID: TC_ECOMMERCE_CART_ADD_TWO_DIFFERENT_PRODUCTS_VERIFY_CART_TOTAL_PRICE_CALCULATION_003</w:t>
+        <w:t xml:space="preserve">ID: </w:t>
+      </w:r>
+      <w:r>
+        <w:t>TC_CART_ADD_TWO_PRODUCTS_TOTAL_PRICE_003</w:t>
       </w:r>
     </w:p>
     <w:p>
@@ -385,7 +394,10 @@
     </w:p>
     <w:p>
       <w:r>
-        <w:t>ID: TC_ECOMMERCE_CART_REMOVE_SINGLE_PRODUCT_FROM_CART_VERIFY_CART_ITEM_DELETED_004</w:t>
+        <w:t xml:space="preserve">ID: </w:t>
+      </w:r>
+      <w:r>
+        <w:t>TC_CART_REMOVE_PRODUCT_ITEM_DELETED_004</w:t>
       </w:r>
     </w:p>
     <w:p>
@@ -488,34 +500,130 @@
     </w:p>
     <w:p>
       <w:r>
+        <w:t xml:space="preserve">ID: </w:t>
+      </w:r>
+      <w:r>
+        <w:t>TC_CART_REMOVE_ONE_KEEP_OTHERS_005</w:t>
+      </w:r>
+    </w:p>
+    <w:p>
+      <w:pPr>
+        <w:rPr>
+          <w:lang w:val="pl-PL"/>
+        </w:rPr>
+      </w:pPr>
+      <w:r>
+        <w:rPr>
+          <w:lang w:val="pl-PL"/>
+        </w:rPr>
+        <w:t>Nazwa testu: Usunięcie jednego z kilku produktów</w:t>
+      </w:r>
+    </w:p>
+    <w:p>
+      <w:pPr>
+        <w:rPr>
+          <w:lang w:val="pl-PL"/>
+        </w:rPr>
+      </w:pPr>
+      <w:r>
+        <w:rPr>
+          <w:lang w:val="pl-PL"/>
+        </w:rPr>
+        <w:t>Założenia: W koszyku znajdują się co najmniej dwa różne produkty.</w:t>
+      </w:r>
+    </w:p>
+    <w:p>
+      <w:pPr>
+        <w:rPr>
+          <w:lang w:val="pl-PL"/>
+        </w:rPr>
+      </w:pPr>
+      <w:r>
+        <w:rPr>
+          <w:lang w:val="pl-PL"/>
+        </w:rPr>
+        <w:t>Kroki wykonania:</w:t>
+      </w:r>
+    </w:p>
+    <w:p>
+      <w:pPr>
+        <w:rPr>
+          <w:lang w:val="pl-PL"/>
+        </w:rPr>
+      </w:pPr>
+      <w:r>
+        <w:rPr>
+          <w:lang w:val="pl-PL"/>
+        </w:rPr>
+        <w:t>1. Otwórz koszyk.</w:t>
+      </w:r>
+    </w:p>
+    <w:p>
+      <w:pPr>
+        <w:rPr>
+          <w:lang w:val="pl-PL"/>
+        </w:rPr>
+      </w:pPr>
+      <w:r>
+        <w:rPr>
+          <w:lang w:val="pl-PL"/>
+        </w:rPr>
+        <w:t>2. Usuń jeden z produktów z koszyka.</w:t>
+      </w:r>
+    </w:p>
+    <w:p>
+      <w:pPr>
+        <w:rPr>
+          <w:lang w:val="pl-PL"/>
+        </w:rPr>
+      </w:pPr>
+      <w:r>
+        <w:rPr>
+          <w:lang w:val="pl-PL"/>
+        </w:rPr>
         <w:lastRenderedPageBreak/>
-        <w:t>ID: TC_ECOMMERCE_CART_REMOVE_ONE_PRODUCT_FROM_MULTIPLE_ITEMS_VERIFY_OTHER_ITEMS_REMAIN_005</w:t>
-      </w:r>
-    </w:p>
-    <w:p>
-      <w:pPr>
-        <w:rPr>
-          <w:lang w:val="pl-PL"/>
-        </w:rPr>
-      </w:pPr>
-      <w:r>
-        <w:rPr>
-          <w:lang w:val="pl-PL"/>
-        </w:rPr>
-        <w:t>Nazwa testu: Usunięcie jednego z kilku produktów</w:t>
-      </w:r>
-    </w:p>
-    <w:p>
-      <w:pPr>
-        <w:rPr>
-          <w:lang w:val="pl-PL"/>
-        </w:rPr>
-      </w:pPr>
-      <w:r>
-        <w:rPr>
-          <w:lang w:val="pl-PL"/>
-        </w:rPr>
-        <w:t>Założenia: W koszyku znajdują się co najmniej dwa różne produkty.</w:t>
+        <w:t>Oczekiwany wynik: Usunięty zostaje tylko wskazany produkt, pozostałe produkty nadal znajdują się w koszyku.</w:t>
+      </w:r>
+    </w:p>
+    <w:p>
+      <w:pPr>
+        <w:rPr>
+          <w:lang w:val="pl-PL"/>
+        </w:rPr>
+      </w:pPr>
+    </w:p>
+    <w:p>
+      <w:r>
+        <w:t xml:space="preserve">ID: </w:t>
+      </w:r>
+      <w:r>
+        <w:t>TC_CART_EMPTY_VERIFY_MESSAGE_006</w:t>
+      </w:r>
+    </w:p>
+    <w:p>
+      <w:pPr>
+        <w:rPr>
+          <w:lang w:val="pl-PL"/>
+        </w:rPr>
+      </w:pPr>
+      <w:r>
+        <w:rPr>
+          <w:lang w:val="pl-PL"/>
+        </w:rPr>
+        <w:t>Nazwa testu: Sprawdzenie komunikatu pustego koszyka</w:t>
+      </w:r>
+    </w:p>
+    <w:p>
+      <w:pPr>
+        <w:rPr>
+          <w:lang w:val="pl-PL"/>
+        </w:rPr>
+      </w:pPr>
+      <w:r>
+        <w:rPr>
+          <w:lang w:val="pl-PL"/>
+        </w:rPr>
+        <w:t>Założenia: Koszyk nie zawiera żadnych produktów.</w:t>
       </w:r>
     </w:p>
     <w:p>
@@ -541,6 +649,1043 @@
         <w:rPr>
           <w:lang w:val="pl-PL"/>
         </w:rPr>
+        <w:t>1. Otwórz koszyk bez dodanych produktów.</w:t>
+      </w:r>
+    </w:p>
+    <w:p>
+      <w:pPr>
+        <w:rPr>
+          <w:lang w:val="pl-PL"/>
+        </w:rPr>
+      </w:pPr>
+      <w:r>
+        <w:rPr>
+          <w:lang w:val="pl-PL"/>
+        </w:rPr>
+        <w:t>Oczekiwany wynik: System wyświetla komunikat informujący, że koszyk jest pusty.</w:t>
+      </w:r>
+    </w:p>
+    <w:p>
+      <w:pPr>
+        <w:rPr>
+          <w:lang w:val="pl-PL"/>
+        </w:rPr>
+      </w:pPr>
+    </w:p>
+    <w:p>
+      <w:r>
+        <w:t xml:space="preserve">ID: </w:t>
+      </w:r>
+      <w:r>
+        <w:t>TC_SORT_PRICE_ASC_LOWEST_FIRST_007</w:t>
+      </w:r>
+    </w:p>
+    <w:p>
+      <w:pPr>
+        <w:rPr>
+          <w:lang w:val="pl-PL"/>
+        </w:rPr>
+      </w:pPr>
+      <w:r>
+        <w:rPr>
+          <w:lang w:val="pl-PL"/>
+        </w:rPr>
+        <w:t>Nazwa testu: Sortowanie produktów od najniższej ceny</w:t>
+      </w:r>
+    </w:p>
+    <w:p>
+      <w:pPr>
+        <w:rPr>
+          <w:lang w:val="pl-PL"/>
+        </w:rPr>
+      </w:pPr>
+      <w:r>
+        <w:rPr>
+          <w:lang w:val="pl-PL"/>
+        </w:rPr>
+        <w:t>Założenia: Użytkownik znajduje się na stronie kategorii produktów.</w:t>
+      </w:r>
+    </w:p>
+    <w:p>
+      <w:pPr>
+        <w:rPr>
+          <w:lang w:val="pl-PL"/>
+        </w:rPr>
+      </w:pPr>
+      <w:r>
+        <w:rPr>
+          <w:lang w:val="pl-PL"/>
+        </w:rPr>
+        <w:t>Kroki wykonania:</w:t>
+      </w:r>
+    </w:p>
+    <w:p>
+      <w:pPr>
+        <w:rPr>
+          <w:lang w:val="pl-PL"/>
+        </w:rPr>
+      </w:pPr>
+      <w:r>
+        <w:rPr>
+          <w:lang w:val="pl-PL"/>
+        </w:rPr>
+        <w:t>1. Otwórz kategorię produktów.</w:t>
+      </w:r>
+    </w:p>
+    <w:p>
+      <w:pPr>
+        <w:rPr>
+          <w:lang w:val="pl-PL"/>
+        </w:rPr>
+      </w:pPr>
+      <w:r>
+        <w:rPr>
+          <w:lang w:val="pl-PL"/>
+        </w:rPr>
+        <w:t>2. Otwórz listę opcji sortowania.</w:t>
+      </w:r>
+    </w:p>
+    <w:p>
+      <w:pPr>
+        <w:rPr>
+          <w:lang w:val="pl-PL"/>
+        </w:rPr>
+      </w:pPr>
+      <w:r>
+        <w:rPr>
+          <w:lang w:val="pl-PL"/>
+        </w:rPr>
+        <w:t>3. Wybierz opcję „Od najniższej ceny”.</w:t>
+      </w:r>
+    </w:p>
+    <w:p>
+      <w:pPr>
+        <w:rPr>
+          <w:lang w:val="pl-PL"/>
+        </w:rPr>
+      </w:pPr>
+      <w:r>
+        <w:rPr>
+          <w:lang w:val="pl-PL"/>
+        </w:rPr>
+        <w:t>Oczekiwany wynik: Na początku listy wyświetlane są produkty o najniższej cenie.</w:t>
+      </w:r>
+    </w:p>
+    <w:p>
+      <w:pPr>
+        <w:rPr>
+          <w:lang w:val="pl-PL"/>
+        </w:rPr>
+      </w:pPr>
+    </w:p>
+    <w:p>
+      <w:r>
+        <w:t xml:space="preserve">ID: </w:t>
+      </w:r>
+      <w:r>
+        <w:t>TC_SORT_PRICE_DESC_HIGHEST_FIRST_008</w:t>
+      </w:r>
+    </w:p>
+    <w:p>
+      <w:pPr>
+        <w:rPr>
+          <w:lang w:val="pl-PL"/>
+        </w:rPr>
+      </w:pPr>
+      <w:r>
+        <w:rPr>
+          <w:lang w:val="pl-PL"/>
+        </w:rPr>
+        <w:t>Nazwa testu: Sortowanie produktów od najwyższej ceny</w:t>
+      </w:r>
+    </w:p>
+    <w:p>
+      <w:pPr>
+        <w:rPr>
+          <w:lang w:val="pl-PL"/>
+        </w:rPr>
+      </w:pPr>
+      <w:r>
+        <w:rPr>
+          <w:lang w:val="pl-PL"/>
+        </w:rPr>
+        <w:t>Założenia: Użytkownik jest na stronie kategorii.</w:t>
+      </w:r>
+    </w:p>
+    <w:p>
+      <w:pPr>
+        <w:rPr>
+          <w:lang w:val="pl-PL"/>
+        </w:rPr>
+      </w:pPr>
+      <w:r>
+        <w:rPr>
+          <w:lang w:val="pl-PL"/>
+        </w:rPr>
+        <w:t>Kroki wykonania:</w:t>
+      </w:r>
+    </w:p>
+    <w:p>
+      <w:pPr>
+        <w:rPr>
+          <w:lang w:val="pl-PL"/>
+        </w:rPr>
+      </w:pPr>
+      <w:r>
+        <w:rPr>
+          <w:lang w:val="pl-PL"/>
+        </w:rPr>
+        <w:t>1. Otwórz opcję sortowania.</w:t>
+      </w:r>
+    </w:p>
+    <w:p>
+      <w:pPr>
+        <w:rPr>
+          <w:lang w:val="pl-PL"/>
+        </w:rPr>
+      </w:pPr>
+      <w:r>
+        <w:rPr>
+          <w:lang w:val="pl-PL"/>
+        </w:rPr>
+        <w:t>2. Wybierz „Od najwyższej ceny”.</w:t>
+      </w:r>
+    </w:p>
+    <w:p>
+      <w:pPr>
+        <w:rPr>
+          <w:lang w:val="pl-PL"/>
+        </w:rPr>
+      </w:pPr>
+      <w:r>
+        <w:rPr>
+          <w:lang w:val="pl-PL"/>
+        </w:rPr>
+        <w:t>Oczekiwany wynik: Na początku listy wyświetlane są produkty o najwyższej cenie.</w:t>
+      </w:r>
+    </w:p>
+    <w:p>
+      <w:pPr>
+        <w:rPr>
+          <w:lang w:val="pl-PL"/>
+        </w:rPr>
+      </w:pPr>
+    </w:p>
+    <w:p>
+      <w:r>
+        <w:t xml:space="preserve">ID: </w:t>
+      </w:r>
+      <w:r>
+        <w:t>TC_SORT_NAME_ASC_A_TO_Z_009</w:t>
+      </w:r>
+    </w:p>
+    <w:p>
+      <w:pPr>
+        <w:rPr>
+          <w:lang w:val="pl-PL"/>
+        </w:rPr>
+      </w:pPr>
+      <w:r>
+        <w:rPr>
+          <w:lang w:val="pl-PL"/>
+        </w:rPr>
+        <w:t>Nazwa testu: Sortowanie produktów alfabetycznie A-Z</w:t>
+      </w:r>
+    </w:p>
+    <w:p>
+      <w:pPr>
+        <w:rPr>
+          <w:lang w:val="pl-PL"/>
+        </w:rPr>
+      </w:pPr>
+      <w:r>
+        <w:rPr>
+          <w:lang w:val="pl-PL"/>
+        </w:rPr>
+        <w:t>Założenia: Użytkownik jest na stronie kategorii produktów.</w:t>
+      </w:r>
+    </w:p>
+    <w:p>
+      <w:pPr>
+        <w:rPr>
+          <w:lang w:val="pl-PL"/>
+        </w:rPr>
+      </w:pPr>
+      <w:r>
+        <w:rPr>
+          <w:lang w:val="pl-PL"/>
+        </w:rPr>
+        <w:t>Kroki wykonania:</w:t>
+      </w:r>
+    </w:p>
+    <w:p>
+      <w:pPr>
+        <w:rPr>
+          <w:lang w:val="pl-PL"/>
+        </w:rPr>
+      </w:pPr>
+      <w:r>
+        <w:rPr>
+          <w:lang w:val="pl-PL"/>
+        </w:rPr>
+        <w:t>1. Otwórz opcję sortowania.</w:t>
+      </w:r>
+    </w:p>
+    <w:p>
+      <w:pPr>
+        <w:rPr>
+          <w:lang w:val="pl-PL"/>
+        </w:rPr>
+      </w:pPr>
+      <w:r>
+        <w:rPr>
+          <w:lang w:val="pl-PL"/>
+        </w:rPr>
+        <w:t>2. Wybierz „Nazwa produktu A-Z”.</w:t>
+      </w:r>
+    </w:p>
+    <w:p>
+      <w:pPr>
+        <w:rPr>
+          <w:lang w:val="pl-PL"/>
+        </w:rPr>
+      </w:pPr>
+      <w:r>
+        <w:rPr>
+          <w:lang w:val="pl-PL"/>
+        </w:rPr>
+        <w:t>Oczekiwany wynik: Produkty wyświetlane są w kolejności alfabetycznej rosnącej.</w:t>
+      </w:r>
+    </w:p>
+    <w:p>
+      <w:pPr>
+        <w:rPr>
+          <w:lang w:val="pl-PL"/>
+        </w:rPr>
+      </w:pPr>
+    </w:p>
+    <w:p>
+      <w:r>
+        <w:t xml:space="preserve">ID: </w:t>
+      </w:r>
+      <w:r>
+        <w:t>TC_SORT_NAME_DESC_Z_TO_A_010</w:t>
+      </w:r>
+    </w:p>
+    <w:p>
+      <w:pPr>
+        <w:rPr>
+          <w:lang w:val="pl-PL"/>
+        </w:rPr>
+      </w:pPr>
+      <w:r>
+        <w:rPr>
+          <w:lang w:val="pl-PL"/>
+        </w:rPr>
+        <w:t>Nazwa testu: Sortowanie produktów alfabetycznie Z-A</w:t>
+      </w:r>
+    </w:p>
+    <w:p>
+      <w:pPr>
+        <w:rPr>
+          <w:lang w:val="pl-PL"/>
+        </w:rPr>
+      </w:pPr>
+      <w:r>
+        <w:rPr>
+          <w:lang w:val="pl-PL"/>
+        </w:rPr>
+        <w:t>Założenia: Użytkownik jest na stronie kategorii produktów.</w:t>
+      </w:r>
+    </w:p>
+    <w:p>
+      <w:pPr>
+        <w:rPr>
+          <w:lang w:val="pl-PL"/>
+        </w:rPr>
+      </w:pPr>
+      <w:r>
+        <w:rPr>
+          <w:lang w:val="pl-PL"/>
+        </w:rPr>
+        <w:t>Kroki wykonania:</w:t>
+      </w:r>
+    </w:p>
+    <w:p>
+      <w:pPr>
+        <w:rPr>
+          <w:lang w:val="pl-PL"/>
+        </w:rPr>
+      </w:pPr>
+      <w:r>
+        <w:rPr>
+          <w:lang w:val="pl-PL"/>
+        </w:rPr>
+        <w:t>1. Otwórz opcję sortowania.</w:t>
+      </w:r>
+    </w:p>
+    <w:p>
+      <w:pPr>
+        <w:rPr>
+          <w:lang w:val="pl-PL"/>
+        </w:rPr>
+      </w:pPr>
+      <w:r>
+        <w:rPr>
+          <w:lang w:val="pl-PL"/>
+        </w:rPr>
+        <w:t>2. Wybierz „Nazwa produktu Z-A”.</w:t>
+      </w:r>
+    </w:p>
+    <w:p>
+      <w:pPr>
+        <w:rPr>
+          <w:lang w:val="pl-PL"/>
+        </w:rPr>
+      </w:pPr>
+      <w:r>
+        <w:rPr>
+          <w:lang w:val="pl-PL"/>
+        </w:rPr>
+        <w:t>Oczekiwany wynik: Produkty wyświetlane są w kolejności alfabetycznej malejącej.</w:t>
+      </w:r>
+    </w:p>
+    <w:p>
+      <w:pPr>
+        <w:rPr>
+          <w:lang w:val="pl-PL"/>
+        </w:rPr>
+      </w:pPr>
+    </w:p>
+    <w:p>
+      <w:r>
+        <w:t xml:space="preserve">ID: </w:t>
+      </w:r>
+      <w:r>
+        <w:t>TC_LOGIN_VALID_SUCCESS_011</w:t>
+      </w:r>
+    </w:p>
+    <w:p>
+      <w:pPr>
+        <w:rPr>
+          <w:lang w:val="pl-PL"/>
+        </w:rPr>
+      </w:pPr>
+      <w:r>
+        <w:rPr>
+          <w:lang w:val="pl-PL"/>
+        </w:rPr>
+        <w:t>Nazwa testu: Logowanie poprawnymi danymi</w:t>
+      </w:r>
+    </w:p>
+    <w:p>
+      <w:pPr>
+        <w:rPr>
+          <w:lang w:val="pl-PL"/>
+        </w:rPr>
+      </w:pPr>
+      <w:r>
+        <w:rPr>
+          <w:lang w:val="pl-PL"/>
+        </w:rPr>
+        <w:t>Założenia: Użytkownik posiada aktywne konto w sklepie.</w:t>
+      </w:r>
+    </w:p>
+    <w:p>
+      <w:pPr>
+        <w:rPr>
+          <w:lang w:val="pl-PL"/>
+        </w:rPr>
+      </w:pPr>
+      <w:r>
+        <w:rPr>
+          <w:lang w:val="pl-PL"/>
+        </w:rPr>
+        <w:t>Kroki wykonania:</w:t>
+      </w:r>
+    </w:p>
+    <w:p>
+      <w:pPr>
+        <w:rPr>
+          <w:lang w:val="pl-PL"/>
+        </w:rPr>
+      </w:pPr>
+      <w:r>
+        <w:rPr>
+          <w:lang w:val="pl-PL"/>
+        </w:rPr>
+        <w:t>1. Kliknij przycisk „Konto”.</w:t>
+      </w:r>
+    </w:p>
+    <w:p>
+      <w:pPr>
+        <w:rPr>
+          <w:lang w:val="pl-PL"/>
+        </w:rPr>
+      </w:pPr>
+      <w:r>
+        <w:rPr>
+          <w:lang w:val="pl-PL"/>
+        </w:rPr>
+        <w:t>2. Wpisz poprawny adres e-mail.</w:t>
+      </w:r>
+    </w:p>
+    <w:p>
+      <w:pPr>
+        <w:rPr>
+          <w:lang w:val="pl-PL"/>
+        </w:rPr>
+      </w:pPr>
+      <w:r>
+        <w:rPr>
+          <w:lang w:val="pl-PL"/>
+        </w:rPr>
+        <w:t>3. Wpisz poprawne hasło.</w:t>
+      </w:r>
+    </w:p>
+    <w:p>
+      <w:pPr>
+        <w:rPr>
+          <w:lang w:val="pl-PL"/>
+        </w:rPr>
+      </w:pPr>
+      <w:r>
+        <w:rPr>
+          <w:lang w:val="pl-PL"/>
+        </w:rPr>
+        <w:t>4. Kliknij „Zaloguj się”.</w:t>
+      </w:r>
+    </w:p>
+    <w:p>
+      <w:pPr>
+        <w:rPr>
+          <w:lang w:val="pl-PL"/>
+        </w:rPr>
+      </w:pPr>
+      <w:r>
+        <w:rPr>
+          <w:lang w:val="pl-PL"/>
+        </w:rPr>
+        <w:t>Oczekiwany wynik: Użytkownik zostaje zalogowany i ma dostęp do panelu konta.</w:t>
+      </w:r>
+    </w:p>
+    <w:p>
+      <w:pPr>
+        <w:rPr>
+          <w:lang w:val="pl-PL"/>
+        </w:rPr>
+      </w:pPr>
+    </w:p>
+    <w:p>
+      <w:r>
+        <w:t xml:space="preserve">ID: </w:t>
+      </w:r>
+      <w:r>
+        <w:t>TC_LOGIN_INVALID_PASSWORD_ERROR_012</w:t>
+      </w:r>
+    </w:p>
+    <w:p>
+      <w:pPr>
+        <w:rPr>
+          <w:lang w:val="pl-PL"/>
+        </w:rPr>
+      </w:pPr>
+      <w:r>
+        <w:rPr>
+          <w:lang w:val="pl-PL"/>
+        </w:rPr>
+        <w:t>Nazwa testu: Logowanie błędnym hasłem</w:t>
+      </w:r>
+    </w:p>
+    <w:p>
+      <w:pPr>
+        <w:rPr>
+          <w:lang w:val="pl-PL"/>
+        </w:rPr>
+      </w:pPr>
+      <w:r>
+        <w:rPr>
+          <w:lang w:val="pl-PL"/>
+        </w:rPr>
+        <w:t>Założenia: Użytkownik posiada konto w systemie.</w:t>
+      </w:r>
+    </w:p>
+    <w:p>
+      <w:pPr>
+        <w:rPr>
+          <w:lang w:val="pl-PL"/>
+        </w:rPr>
+      </w:pPr>
+      <w:r>
+        <w:rPr>
+          <w:lang w:val="pl-PL"/>
+        </w:rPr>
+        <w:t>Kroki wykonania:</w:t>
+      </w:r>
+    </w:p>
+    <w:p>
+      <w:pPr>
+        <w:rPr>
+          <w:lang w:val="pl-PL"/>
+        </w:rPr>
+      </w:pPr>
+      <w:r>
+        <w:rPr>
+          <w:lang w:val="pl-PL"/>
+        </w:rPr>
+        <w:t>1. Przejdź do strony logowania.</w:t>
+      </w:r>
+    </w:p>
+    <w:p>
+      <w:pPr>
+        <w:rPr>
+          <w:lang w:val="pl-PL"/>
+        </w:rPr>
+      </w:pPr>
+      <w:r>
+        <w:rPr>
+          <w:lang w:val="pl-PL"/>
+        </w:rPr>
+        <w:t>2. Wpisz poprawny e-mail.</w:t>
+      </w:r>
+    </w:p>
+    <w:p>
+      <w:pPr>
+        <w:rPr>
+          <w:lang w:val="pl-PL"/>
+        </w:rPr>
+      </w:pPr>
+      <w:r>
+        <w:rPr>
+          <w:lang w:val="pl-PL"/>
+        </w:rPr>
+        <w:t>3. Wpisz niepoprawne hasło.</w:t>
+      </w:r>
+    </w:p>
+    <w:p>
+      <w:pPr>
+        <w:rPr>
+          <w:lang w:val="pl-PL"/>
+        </w:rPr>
+      </w:pPr>
+      <w:r>
+        <w:rPr>
+          <w:lang w:val="pl-PL"/>
+        </w:rPr>
+        <w:t>4. Kliknij „Zaloguj się”.</w:t>
+      </w:r>
+    </w:p>
+    <w:p>
+      <w:pPr>
+        <w:rPr>
+          <w:lang w:val="pl-PL"/>
+        </w:rPr>
+      </w:pPr>
+      <w:r>
+        <w:rPr>
+          <w:lang w:val="pl-PL"/>
+        </w:rPr>
+        <w:t>Oczekiwany wynik: System wyświetla komunikat o błędnych danych logowania.</w:t>
+      </w:r>
+    </w:p>
+    <w:p>
+      <w:pPr>
+        <w:rPr>
+          <w:lang w:val="pl-PL"/>
+        </w:rPr>
+      </w:pPr>
+    </w:p>
+    <w:p>
+      <w:r>
+        <w:t xml:space="preserve">ID: </w:t>
+      </w:r>
+      <w:r>
+        <w:t>TC_LOGIN_EMPTY_FIELDS_VALIDATION_013</w:t>
+      </w:r>
+    </w:p>
+    <w:p>
+      <w:pPr>
+        <w:rPr>
+          <w:lang w:val="pl-PL"/>
+        </w:rPr>
+      </w:pPr>
+      <w:r>
+        <w:rPr>
+          <w:lang w:val="pl-PL"/>
+        </w:rPr>
+        <w:t>Nazwa testu: Walidacja pustych pól logowania</w:t>
+      </w:r>
+    </w:p>
+    <w:p>
+      <w:pPr>
+        <w:rPr>
+          <w:lang w:val="pl-PL"/>
+        </w:rPr>
+      </w:pPr>
+      <w:r>
+        <w:rPr>
+          <w:lang w:val="pl-PL"/>
+        </w:rPr>
+        <w:t>Założenia: Użytkownik jest na stronie logowania.</w:t>
+      </w:r>
+    </w:p>
+    <w:p>
+      <w:pPr>
+        <w:rPr>
+          <w:lang w:val="pl-PL"/>
+        </w:rPr>
+      </w:pPr>
+      <w:r>
+        <w:rPr>
+          <w:lang w:val="pl-PL"/>
+        </w:rPr>
+        <w:t>Kroki wykonania:</w:t>
+      </w:r>
+    </w:p>
+    <w:p>
+      <w:pPr>
+        <w:rPr>
+          <w:lang w:val="pl-PL"/>
+        </w:rPr>
+      </w:pPr>
+      <w:r>
+        <w:rPr>
+          <w:lang w:val="pl-PL"/>
+        </w:rPr>
+        <w:t>1. Nie wpisuj żadnych danych w formularzu.</w:t>
+      </w:r>
+    </w:p>
+    <w:p>
+      <w:pPr>
+        <w:rPr>
+          <w:lang w:val="pl-PL"/>
+        </w:rPr>
+      </w:pPr>
+      <w:r>
+        <w:rPr>
+          <w:lang w:val="pl-PL"/>
+        </w:rPr>
+        <w:t>2. Kliknij przycisk „Zaloguj się”.</w:t>
+      </w:r>
+    </w:p>
+    <w:p>
+      <w:pPr>
+        <w:rPr>
+          <w:lang w:val="pl-PL"/>
+        </w:rPr>
+      </w:pPr>
+      <w:r>
+        <w:rPr>
+          <w:lang w:val="pl-PL"/>
+        </w:rPr>
+        <w:t>Oczekiwany wynik: System wyświetla komunikaty o wymaganych polach formularza.</w:t>
+      </w:r>
+    </w:p>
+    <w:p>
+      <w:pPr>
+        <w:rPr>
+          <w:lang w:val="pl-PL"/>
+        </w:rPr>
+      </w:pPr>
+    </w:p>
+    <w:p>
+      <w:r>
+        <w:t xml:space="preserve">ID: </w:t>
+      </w:r>
+      <w:r>
+        <w:t>TC_PASSWORD_RESET_NAVIGATION_014</w:t>
+      </w:r>
+    </w:p>
+    <w:p>
+      <w:pPr>
+        <w:rPr>
+          <w:lang w:val="pl-PL"/>
+        </w:rPr>
+      </w:pPr>
+      <w:r>
+        <w:rPr>
+          <w:lang w:val="pl-PL"/>
+        </w:rPr>
+        <w:t>Nazwa testu: Przejście do odzyskiwania hasła</w:t>
+      </w:r>
+    </w:p>
+    <w:p>
+      <w:pPr>
+        <w:rPr>
+          <w:lang w:val="pl-PL"/>
+        </w:rPr>
+      </w:pPr>
+      <w:r>
+        <w:rPr>
+          <w:lang w:val="pl-PL"/>
+        </w:rPr>
+        <w:t>Założenia: Użytkownik znajduje się na stronie logowania.</w:t>
+      </w:r>
+    </w:p>
+    <w:p>
+      <w:pPr>
+        <w:rPr>
+          <w:lang w:val="pl-PL"/>
+        </w:rPr>
+      </w:pPr>
+      <w:r>
+        <w:rPr>
+          <w:lang w:val="pl-PL"/>
+        </w:rPr>
+        <w:t>Kroki wykonania:</w:t>
+      </w:r>
+    </w:p>
+    <w:p>
+      <w:pPr>
+        <w:rPr>
+          <w:lang w:val="pl-PL"/>
+        </w:rPr>
+      </w:pPr>
+      <w:r>
+        <w:rPr>
+          <w:lang w:val="pl-PL"/>
+        </w:rPr>
+        <w:t>1. Kliknij link „Nie pamiętasz hasła?”.</w:t>
+      </w:r>
+    </w:p>
+    <w:p>
+      <w:pPr>
+        <w:rPr>
+          <w:lang w:val="pl-PL"/>
+        </w:rPr>
+      </w:pPr>
+      <w:r>
+        <w:rPr>
+          <w:lang w:val="pl-PL"/>
+        </w:rPr>
+        <w:t>Oczekiwany wynik: Użytkownik zostaje przeniesiony na stronę resetowania hasła.</w:t>
+      </w:r>
+    </w:p>
+    <w:p>
+      <w:pPr>
+        <w:rPr>
+          <w:lang w:val="pl-PL"/>
+        </w:rPr>
+      </w:pPr>
+    </w:p>
+    <w:p>
+      <w:r>
+        <w:lastRenderedPageBreak/>
+        <w:t xml:space="preserve">ID: </w:t>
+      </w:r>
+      <w:r>
+        <w:t>TC_ACCESS_NO_LOGIN_REDIRECT_015</w:t>
+      </w:r>
+    </w:p>
+    <w:p>
+      <w:pPr>
+        <w:rPr>
+          <w:lang w:val="pl-PL"/>
+        </w:rPr>
+      </w:pPr>
+      <w:r>
+        <w:rPr>
+          <w:lang w:val="pl-PL"/>
+        </w:rPr>
+        <w:t>Nazwa testu: Próba wejścia do konta bez logowania</w:t>
+      </w:r>
+    </w:p>
+    <w:p>
+      <w:pPr>
+        <w:rPr>
+          <w:lang w:val="pl-PL"/>
+        </w:rPr>
+      </w:pPr>
+      <w:r>
+        <w:rPr>
+          <w:lang w:val="pl-PL"/>
+        </w:rPr>
+        <w:t>Założenia: Użytkownik nie jest zalogowany.</w:t>
+      </w:r>
+    </w:p>
+    <w:p>
+      <w:pPr>
+        <w:rPr>
+          <w:lang w:val="pl-PL"/>
+        </w:rPr>
+      </w:pPr>
+      <w:r>
+        <w:rPr>
+          <w:lang w:val="pl-PL"/>
+        </w:rPr>
+        <w:t>Kroki wykonania:</w:t>
+      </w:r>
+    </w:p>
+    <w:p>
+      <w:pPr>
+        <w:rPr>
+          <w:lang w:val="pl-PL"/>
+        </w:rPr>
+      </w:pPr>
+      <w:r>
+        <w:rPr>
+          <w:lang w:val="pl-PL"/>
+        </w:rPr>
+        <w:t>1. Kliknij ikonę „Konto”.</w:t>
+      </w:r>
+    </w:p>
+    <w:p>
+      <w:pPr>
+        <w:rPr>
+          <w:lang w:val="pl-PL"/>
+        </w:rPr>
+      </w:pPr>
+      <w:r>
+        <w:rPr>
+          <w:lang w:val="pl-PL"/>
+        </w:rPr>
+        <w:t>Oczekiwany wynik: System przekierowuje użytkownika na stronę logowania.</w:t>
+      </w:r>
+    </w:p>
+    <w:p>
+      <w:pPr>
+        <w:rPr>
+          <w:lang w:val="pl-PL"/>
+        </w:rPr>
+      </w:pPr>
+    </w:p>
+    <w:p>
+      <w:r>
+        <w:t xml:space="preserve">ID: </w:t>
+      </w:r>
+      <w:r>
+        <w:t>TC_FAV_NO_LOGIN_REQUIRE_LOGIN_016</w:t>
+      </w:r>
+    </w:p>
+    <w:p>
+      <w:pPr>
+        <w:rPr>
+          <w:lang w:val="pl-PL"/>
+        </w:rPr>
+      </w:pPr>
+      <w:r>
+        <w:rPr>
+          <w:lang w:val="pl-PL"/>
+        </w:rPr>
+        <w:t>Nazwa testu: Wejście w ulubione bez logowania</w:t>
+      </w:r>
+    </w:p>
+    <w:p>
+      <w:pPr>
+        <w:rPr>
+          <w:lang w:val="pl-PL"/>
+        </w:rPr>
+      </w:pPr>
+      <w:r>
+        <w:rPr>
+          <w:lang w:val="pl-PL"/>
+        </w:rPr>
+        <w:t>Założenia: Użytkownik nie jest zalogowany.</w:t>
+      </w:r>
+    </w:p>
+    <w:p>
+      <w:pPr>
+        <w:rPr>
+          <w:lang w:val="pl-PL"/>
+        </w:rPr>
+      </w:pPr>
+      <w:r>
+        <w:rPr>
+          <w:lang w:val="pl-PL"/>
+        </w:rPr>
+        <w:t>Kroki wykonania:</w:t>
+      </w:r>
+    </w:p>
+    <w:p>
+      <w:pPr>
+        <w:rPr>
+          <w:lang w:val="pl-PL"/>
+        </w:rPr>
+      </w:pPr>
+      <w:r>
+        <w:rPr>
+          <w:lang w:val="pl-PL"/>
+        </w:rPr>
+        <w:t>1. Kliknij sekcję „Ulubione”.</w:t>
+      </w:r>
+    </w:p>
+    <w:p>
+      <w:pPr>
+        <w:rPr>
+          <w:lang w:val="pl-PL"/>
+        </w:rPr>
+      </w:pPr>
+      <w:r>
+        <w:rPr>
+          <w:lang w:val="pl-PL"/>
+        </w:rPr>
+        <w:t>Oczekiwany wynik: System przekierowuje użytkownika na stronę logowania.</w:t>
+      </w:r>
+    </w:p>
+    <w:p>
+      <w:pPr>
+        <w:rPr>
+          <w:lang w:val="pl-PL"/>
+        </w:rPr>
+      </w:pPr>
+    </w:p>
+    <w:p>
+      <w:r>
+        <w:t xml:space="preserve">ID: </w:t>
+      </w:r>
+      <w:r>
+        <w:t>TC_CART_TOTAL_UPDATE_AFTER_REMOVE_017</w:t>
+      </w:r>
+    </w:p>
+    <w:p>
+      <w:pPr>
+        <w:rPr>
+          <w:lang w:val="pl-PL"/>
+        </w:rPr>
+      </w:pPr>
+      <w:r>
+        <w:rPr>
+          <w:lang w:val="pl-PL"/>
+        </w:rPr>
+        <w:t>Nazwa testu: Aktualizacja ceny koszyka po usunięciu produktu</w:t>
+      </w:r>
+    </w:p>
+    <w:p>
+      <w:pPr>
+        <w:rPr>
+          <w:lang w:val="pl-PL"/>
+        </w:rPr>
+      </w:pPr>
+      <w:r>
+        <w:rPr>
+          <w:lang w:val="pl-PL"/>
+        </w:rPr>
+        <w:t>Założenia: W koszyku znajdują się produkty.</w:t>
+      </w:r>
+    </w:p>
+    <w:p>
+      <w:pPr>
+        <w:rPr>
+          <w:lang w:val="pl-PL"/>
+        </w:rPr>
+      </w:pPr>
+      <w:r>
+        <w:rPr>
+          <w:lang w:val="pl-PL"/>
+        </w:rPr>
+        <w:t>Kroki wykonania:</w:t>
+      </w:r>
+    </w:p>
+    <w:p>
+      <w:pPr>
+        <w:rPr>
+          <w:lang w:val="pl-PL"/>
+        </w:rPr>
+      </w:pPr>
+      <w:r>
+        <w:rPr>
+          <w:lang w:val="pl-PL"/>
+        </w:rPr>
         <w:t>1. Otwórz koszyk.</w:t>
       </w:r>
     </w:p>
@@ -554,70 +1699,87 @@
         <w:rPr>
           <w:lang w:val="pl-PL"/>
         </w:rPr>
-        <w:t>2. Usuń jeden z produktów z koszyka.</w:t>
-      </w:r>
-    </w:p>
-    <w:p>
-      <w:pPr>
-        <w:rPr>
-          <w:lang w:val="pl-PL"/>
-        </w:rPr>
-      </w:pPr>
-      <w:r>
-        <w:rPr>
-          <w:lang w:val="pl-PL"/>
-        </w:rPr>
-        <w:t>Oczekiwany wynik: Usunięty zostaje tylko wskazany produkt, pozostałe produkty nadal znajdują się w koszyku.</w:t>
-      </w:r>
-    </w:p>
-    <w:p>
-      <w:pPr>
-        <w:rPr>
-          <w:lang w:val="pl-PL"/>
-        </w:rPr>
-      </w:pPr>
-    </w:p>
-    <w:p>
-      <w:r>
-        <w:t>ID: TC_ECOMMERCE_CART_EMPTY_CART_VERIFY_EMPTY_CART_MESSAGE_DISPLAYED_006</w:t>
-      </w:r>
-    </w:p>
-    <w:p>
-      <w:pPr>
-        <w:rPr>
-          <w:lang w:val="pl-PL"/>
-        </w:rPr>
-      </w:pPr>
-      <w:r>
-        <w:rPr>
-          <w:lang w:val="pl-PL"/>
-        </w:rPr>
-        <w:t>Nazwa testu: Sprawdzenie komunikatu pustego koszyka</w:t>
-      </w:r>
-    </w:p>
-    <w:p>
-      <w:pPr>
-        <w:rPr>
-          <w:lang w:val="pl-PL"/>
-        </w:rPr>
-      </w:pPr>
-      <w:r>
-        <w:rPr>
-          <w:lang w:val="pl-PL"/>
-        </w:rPr>
-        <w:t>Założenia: Koszyk nie zawiera żadnych produktów.</w:t>
-      </w:r>
-    </w:p>
-    <w:p>
-      <w:pPr>
-        <w:rPr>
-          <w:lang w:val="pl-PL"/>
-        </w:rPr>
-      </w:pPr>
-      <w:r>
-        <w:rPr>
-          <w:lang w:val="pl-PL"/>
-        </w:rPr>
+        <w:t>2. Zapamiętaj całkowitą cenę koszyka.</w:t>
+      </w:r>
+    </w:p>
+    <w:p>
+      <w:pPr>
+        <w:rPr>
+          <w:lang w:val="pl-PL"/>
+        </w:rPr>
+      </w:pPr>
+      <w:r>
+        <w:rPr>
+          <w:lang w:val="pl-PL"/>
+        </w:rPr>
+        <w:t>3. Usuń jeden produkt.</w:t>
+      </w:r>
+    </w:p>
+    <w:p>
+      <w:pPr>
+        <w:rPr>
+          <w:lang w:val="pl-PL"/>
+        </w:rPr>
+      </w:pPr>
+      <w:r>
+        <w:rPr>
+          <w:lang w:val="pl-PL"/>
+        </w:rPr>
+        <w:t>Oczekiwany wynik: Całkowita cena koszyka zostaje automatycznie przeliczona.</w:t>
+      </w:r>
+    </w:p>
+    <w:p>
+      <w:pPr>
+        <w:rPr>
+          <w:lang w:val="pl-PL"/>
+        </w:rPr>
+      </w:pPr>
+    </w:p>
+    <w:p>
+      <w:r>
+        <w:t xml:space="preserve">ID: </w:t>
+      </w:r>
+      <w:r>
+        <w:t>TC_CART_ICON_COUNTER_AFTER_ADD_018</w:t>
+      </w:r>
+    </w:p>
+    <w:p>
+      <w:pPr>
+        <w:rPr>
+          <w:lang w:val="pl-PL"/>
+        </w:rPr>
+      </w:pPr>
+      <w:r>
+        <w:rPr>
+          <w:lang w:val="pl-PL"/>
+        </w:rPr>
+        <w:t>Nazwa testu: Aktualizacja licznika koszyka</w:t>
+      </w:r>
+    </w:p>
+    <w:p>
+      <w:pPr>
+        <w:rPr>
+          <w:lang w:val="pl-PL"/>
+        </w:rPr>
+      </w:pPr>
+      <w:r>
+        <w:rPr>
+          <w:lang w:val="pl-PL"/>
+        </w:rPr>
+        <w:t>Założenia: Koszyk jest pusty.</w:t>
+      </w:r>
+    </w:p>
+    <w:p>
+      <w:pPr>
+        <w:rPr>
+          <w:lang w:val="pl-PL"/>
+        </w:rPr>
+      </w:pPr>
+      <w:r>
+        <w:rPr>
+          <w:lang w:val="pl-PL"/>
+        </w:rPr>
+        <w:lastRenderedPageBreak/>
         <w:t>Kroki wykonania:</w:t>
       </w:r>
     </w:p>
@@ -631,58 +1793,74 @@
         <w:rPr>
           <w:lang w:val="pl-PL"/>
         </w:rPr>
-        <w:t>1. Otwórz koszyk bez dodanych produktów.</w:t>
-      </w:r>
-    </w:p>
-    <w:p>
-      <w:pPr>
-        <w:rPr>
-          <w:lang w:val="pl-PL"/>
-        </w:rPr>
-      </w:pPr>
-      <w:r>
-        <w:rPr>
-          <w:lang w:val="pl-PL"/>
-        </w:rPr>
-        <w:t>Oczekiwany wynik: System wyświetla komunikat informujący, że koszyk jest pusty.</w:t>
-      </w:r>
-    </w:p>
-    <w:p>
-      <w:pPr>
-        <w:rPr>
-          <w:lang w:val="pl-PL"/>
-        </w:rPr>
-      </w:pPr>
-    </w:p>
-    <w:p>
-      <w:r>
-        <w:t>ID: TC_ECOMMERCE_PRODUCT_SORT_BY_PRICE_ASCENDING_VERIFY_LOWEST_PRICE_FIRST_007</w:t>
-      </w:r>
-    </w:p>
-    <w:p>
-      <w:pPr>
-        <w:rPr>
-          <w:lang w:val="pl-PL"/>
-        </w:rPr>
-      </w:pPr>
-      <w:r>
-        <w:rPr>
-          <w:lang w:val="pl-PL"/>
-        </w:rPr>
-        <w:t>Nazwa testu: Sortowanie produktów od najniższej ceny</w:t>
-      </w:r>
-    </w:p>
-    <w:p>
-      <w:pPr>
-        <w:rPr>
-          <w:lang w:val="pl-PL"/>
-        </w:rPr>
-      </w:pPr>
-      <w:r>
-        <w:rPr>
-          <w:lang w:val="pl-PL"/>
-        </w:rPr>
-        <w:t>Założenia: Użytkownik znajduje się na stronie kategorii produktów.</w:t>
+        <w:t>1. Dodaj produkt do koszyka.</w:t>
+      </w:r>
+    </w:p>
+    <w:p>
+      <w:pPr>
+        <w:rPr>
+          <w:lang w:val="pl-PL"/>
+        </w:rPr>
+      </w:pPr>
+      <w:r>
+        <w:rPr>
+          <w:lang w:val="pl-PL"/>
+        </w:rPr>
+        <w:t>2. Sprawdź ikonę koszyka w nagłówku strony.</w:t>
+      </w:r>
+    </w:p>
+    <w:p>
+      <w:pPr>
+        <w:rPr>
+          <w:lang w:val="pl-PL"/>
+        </w:rPr>
+      </w:pPr>
+      <w:r>
+        <w:rPr>
+          <w:lang w:val="pl-PL"/>
+        </w:rPr>
+        <w:t>Oczekiwany wynik: Licznik koszyka zwiększa się o 1.</w:t>
+      </w:r>
+    </w:p>
+    <w:p>
+      <w:pPr>
+        <w:rPr>
+          <w:lang w:val="pl-PL"/>
+        </w:rPr>
+      </w:pPr>
+    </w:p>
+    <w:p>
+      <w:r>
+        <w:t xml:space="preserve">ID: </w:t>
+      </w:r>
+      <w:r>
+        <w:t>TC_PRODUCT_PAGE_DETAILS_DISPLAY_019</w:t>
+      </w:r>
+    </w:p>
+    <w:p>
+      <w:pPr>
+        <w:rPr>
+          <w:lang w:val="pl-PL"/>
+        </w:rPr>
+      </w:pPr>
+      <w:r>
+        <w:rPr>
+          <w:lang w:val="pl-PL"/>
+        </w:rPr>
+        <w:t>Nazwa testu: Otwarcie strony produktu</w:t>
+      </w:r>
+    </w:p>
+    <w:p>
+      <w:pPr>
+        <w:rPr>
+          <w:lang w:val="pl-PL"/>
+        </w:rPr>
+      </w:pPr>
+      <w:r>
+        <w:rPr>
+          <w:lang w:val="pl-PL"/>
+        </w:rPr>
+        <w:t>Założenia: Użytkownik znajduje się na stronie kategorii.</w:t>
       </w:r>
     </w:p>
     <w:p>
@@ -708,1130 +1886,6 @@
         <w:rPr>
           <w:lang w:val="pl-PL"/>
         </w:rPr>
-        <w:t>1. Otwórz kategorię produktów.</w:t>
-      </w:r>
-    </w:p>
-    <w:p>
-      <w:pPr>
-        <w:rPr>
-          <w:lang w:val="pl-PL"/>
-        </w:rPr>
-      </w:pPr>
-      <w:r>
-        <w:rPr>
-          <w:lang w:val="pl-PL"/>
-        </w:rPr>
-        <w:t>2. Otwórz listę opcji sortowania.</w:t>
-      </w:r>
-    </w:p>
-    <w:p>
-      <w:pPr>
-        <w:rPr>
-          <w:lang w:val="pl-PL"/>
-        </w:rPr>
-      </w:pPr>
-      <w:r>
-        <w:rPr>
-          <w:lang w:val="pl-PL"/>
-        </w:rPr>
-        <w:t>3. Wybierz opcję „Od najniższej ceny”.</w:t>
-      </w:r>
-    </w:p>
-    <w:p>
-      <w:pPr>
-        <w:rPr>
-          <w:lang w:val="pl-PL"/>
-        </w:rPr>
-      </w:pPr>
-      <w:r>
-        <w:rPr>
-          <w:lang w:val="pl-PL"/>
-        </w:rPr>
-        <w:lastRenderedPageBreak/>
-        <w:t>Oczekiwany wynik: Na początku listy wyświetlane są produkty o najniższej cenie.</w:t>
-      </w:r>
-    </w:p>
-    <w:p>
-      <w:pPr>
-        <w:rPr>
-          <w:lang w:val="pl-PL"/>
-        </w:rPr>
-      </w:pPr>
-    </w:p>
-    <w:p>
-      <w:r>
-        <w:t>ID: TC_ECOMMERCE_PRODUCT_SORT_BY_PRICE_DESCENDING_VERIFY_HIGHEST_PRICE_FIRST_008</w:t>
-      </w:r>
-    </w:p>
-    <w:p>
-      <w:pPr>
-        <w:rPr>
-          <w:lang w:val="pl-PL"/>
-        </w:rPr>
-      </w:pPr>
-      <w:r>
-        <w:rPr>
-          <w:lang w:val="pl-PL"/>
-        </w:rPr>
-        <w:t>Nazwa testu: Sortowanie produktów od najwyższej ceny</w:t>
-      </w:r>
-    </w:p>
-    <w:p>
-      <w:pPr>
-        <w:rPr>
-          <w:lang w:val="pl-PL"/>
-        </w:rPr>
-      </w:pPr>
-      <w:r>
-        <w:rPr>
-          <w:lang w:val="pl-PL"/>
-        </w:rPr>
-        <w:t>Założenia: Użytkownik jest na stronie kategorii.</w:t>
-      </w:r>
-    </w:p>
-    <w:p>
-      <w:pPr>
-        <w:rPr>
-          <w:lang w:val="pl-PL"/>
-        </w:rPr>
-      </w:pPr>
-      <w:r>
-        <w:rPr>
-          <w:lang w:val="pl-PL"/>
-        </w:rPr>
-        <w:t>Kroki wykonania:</w:t>
-      </w:r>
-    </w:p>
-    <w:p>
-      <w:pPr>
-        <w:rPr>
-          <w:lang w:val="pl-PL"/>
-        </w:rPr>
-      </w:pPr>
-      <w:r>
-        <w:rPr>
-          <w:lang w:val="pl-PL"/>
-        </w:rPr>
-        <w:t>1. Otwórz opcję sortowania.</w:t>
-      </w:r>
-    </w:p>
-    <w:p>
-      <w:pPr>
-        <w:rPr>
-          <w:lang w:val="pl-PL"/>
-        </w:rPr>
-      </w:pPr>
-      <w:r>
-        <w:rPr>
-          <w:lang w:val="pl-PL"/>
-        </w:rPr>
-        <w:t>2. Wybierz „Od najwyższej ceny”.</w:t>
-      </w:r>
-    </w:p>
-    <w:p>
-      <w:pPr>
-        <w:rPr>
-          <w:lang w:val="pl-PL"/>
-        </w:rPr>
-      </w:pPr>
-      <w:r>
-        <w:rPr>
-          <w:lang w:val="pl-PL"/>
-        </w:rPr>
-        <w:t>Oczekiwany wynik: Na początku listy wyświetlane są produkty o najwyższej cenie.</w:t>
-      </w:r>
-    </w:p>
-    <w:p>
-      <w:pPr>
-        <w:rPr>
-          <w:lang w:val="pl-PL"/>
-        </w:rPr>
-      </w:pPr>
-    </w:p>
-    <w:p>
-      <w:r>
-        <w:t>ID: TC_ECOMMERCE_PRODUCT_SORT_BY_NAME_ASCENDING_VERIFY_ALPHABETICAL_ORDER_A_TO_Z_009</w:t>
-      </w:r>
-    </w:p>
-    <w:p>
-      <w:pPr>
-        <w:rPr>
-          <w:lang w:val="pl-PL"/>
-        </w:rPr>
-      </w:pPr>
-      <w:r>
-        <w:rPr>
-          <w:lang w:val="pl-PL"/>
-        </w:rPr>
-        <w:t>Nazwa testu: Sortowanie produktów alfabetycznie A-Z</w:t>
-      </w:r>
-    </w:p>
-    <w:p>
-      <w:pPr>
-        <w:rPr>
-          <w:lang w:val="pl-PL"/>
-        </w:rPr>
-      </w:pPr>
-      <w:r>
-        <w:rPr>
-          <w:lang w:val="pl-PL"/>
-        </w:rPr>
-        <w:t>Założenia: Użytkownik jest na stronie kategorii produktów.</w:t>
-      </w:r>
-    </w:p>
-    <w:p>
-      <w:pPr>
-        <w:rPr>
-          <w:lang w:val="pl-PL"/>
-        </w:rPr>
-      </w:pPr>
-      <w:r>
-        <w:rPr>
-          <w:lang w:val="pl-PL"/>
-        </w:rPr>
-        <w:t>Kroki wykonania:</w:t>
-      </w:r>
-    </w:p>
-    <w:p>
-      <w:pPr>
-        <w:rPr>
-          <w:lang w:val="pl-PL"/>
-        </w:rPr>
-      </w:pPr>
-      <w:r>
-        <w:rPr>
-          <w:lang w:val="pl-PL"/>
-        </w:rPr>
-        <w:t>1. Otwórz opcję sortowania.</w:t>
-      </w:r>
-    </w:p>
-    <w:p>
-      <w:pPr>
-        <w:rPr>
-          <w:lang w:val="pl-PL"/>
-        </w:rPr>
-      </w:pPr>
-      <w:r>
-        <w:rPr>
-          <w:lang w:val="pl-PL"/>
-        </w:rPr>
-        <w:t>2. Wybierz „Nazwa produktu A-Z”.</w:t>
-      </w:r>
-    </w:p>
-    <w:p>
-      <w:pPr>
-        <w:rPr>
-          <w:lang w:val="pl-PL"/>
-        </w:rPr>
-      </w:pPr>
-      <w:r>
-        <w:rPr>
-          <w:lang w:val="pl-PL"/>
-        </w:rPr>
-        <w:t>Oczekiwany wynik: Produkty wyświetlane są w kolejności alfabetycznej rosnącej.</w:t>
-      </w:r>
-    </w:p>
-    <w:p>
-      <w:pPr>
-        <w:rPr>
-          <w:lang w:val="pl-PL"/>
-        </w:rPr>
-      </w:pPr>
-    </w:p>
-    <w:p>
-      <w:r>
-        <w:t>ID: TC_ECOMMERCE_PRODUCT_SORT_BY_NAME_DESCENDING_VERIFY_ALPHABETICAL_ORDER_Z_TO_A_010</w:t>
-      </w:r>
-    </w:p>
-    <w:p>
-      <w:pPr>
-        <w:rPr>
-          <w:lang w:val="pl-PL"/>
-        </w:rPr>
-      </w:pPr>
-      <w:r>
-        <w:rPr>
-          <w:lang w:val="pl-PL"/>
-        </w:rPr>
-        <w:t>Nazwa testu: Sortowanie produktów alfabetycznie Z-A</w:t>
-      </w:r>
-    </w:p>
-    <w:p>
-      <w:pPr>
-        <w:rPr>
-          <w:lang w:val="pl-PL"/>
-        </w:rPr>
-      </w:pPr>
-      <w:r>
-        <w:rPr>
-          <w:lang w:val="pl-PL"/>
-        </w:rPr>
-        <w:t>Założenia: Użytkownik jest na stronie kategorii produktów.</w:t>
-      </w:r>
-    </w:p>
-    <w:p>
-      <w:pPr>
-        <w:rPr>
-          <w:lang w:val="pl-PL"/>
-        </w:rPr>
-      </w:pPr>
-      <w:r>
-        <w:rPr>
-          <w:lang w:val="pl-PL"/>
-        </w:rPr>
-        <w:t>Kroki wykonania:</w:t>
-      </w:r>
-    </w:p>
-    <w:p>
-      <w:pPr>
-        <w:rPr>
-          <w:lang w:val="pl-PL"/>
-        </w:rPr>
-      </w:pPr>
-      <w:r>
-        <w:rPr>
-          <w:lang w:val="pl-PL"/>
-        </w:rPr>
-        <w:lastRenderedPageBreak/>
-        <w:t>1. Otwórz opcję sortowania.</w:t>
-      </w:r>
-    </w:p>
-    <w:p>
-      <w:pPr>
-        <w:rPr>
-          <w:lang w:val="pl-PL"/>
-        </w:rPr>
-      </w:pPr>
-      <w:r>
-        <w:rPr>
-          <w:lang w:val="pl-PL"/>
-        </w:rPr>
-        <w:t>2. Wybierz „Nazwa produktu Z-A”.</w:t>
-      </w:r>
-    </w:p>
-    <w:p>
-      <w:pPr>
-        <w:rPr>
-          <w:lang w:val="pl-PL"/>
-        </w:rPr>
-      </w:pPr>
-      <w:r>
-        <w:rPr>
-          <w:lang w:val="pl-PL"/>
-        </w:rPr>
-        <w:t>Oczekiwany wynik: Produkty wyświetlane są w kolejności alfabetycznej malejącej.</w:t>
-      </w:r>
-    </w:p>
-    <w:p>
-      <w:pPr>
-        <w:rPr>
-          <w:lang w:val="pl-PL"/>
-        </w:rPr>
-      </w:pPr>
-    </w:p>
-    <w:p>
-      <w:r>
-        <w:t>ID: TC_ECOMMERCE_LOGIN_WITH_VALID_CREDENTIALS_VERIFY_SUCCESSFUL_ACCOUNT_LOGIN_011</w:t>
-      </w:r>
-    </w:p>
-    <w:p>
-      <w:pPr>
-        <w:rPr>
-          <w:lang w:val="pl-PL"/>
-        </w:rPr>
-      </w:pPr>
-      <w:r>
-        <w:rPr>
-          <w:lang w:val="pl-PL"/>
-        </w:rPr>
-        <w:t>Nazwa testu: Logowanie poprawnymi danymi</w:t>
-      </w:r>
-    </w:p>
-    <w:p>
-      <w:pPr>
-        <w:rPr>
-          <w:lang w:val="pl-PL"/>
-        </w:rPr>
-      </w:pPr>
-      <w:r>
-        <w:rPr>
-          <w:lang w:val="pl-PL"/>
-        </w:rPr>
-        <w:t>Założenia: Użytkownik posiada aktywne konto w sklepie.</w:t>
-      </w:r>
-    </w:p>
-    <w:p>
-      <w:pPr>
-        <w:rPr>
-          <w:lang w:val="pl-PL"/>
-        </w:rPr>
-      </w:pPr>
-      <w:r>
-        <w:rPr>
-          <w:lang w:val="pl-PL"/>
-        </w:rPr>
-        <w:t>Kroki wykonania:</w:t>
-      </w:r>
-    </w:p>
-    <w:p>
-      <w:pPr>
-        <w:rPr>
-          <w:lang w:val="pl-PL"/>
-        </w:rPr>
-      </w:pPr>
-      <w:r>
-        <w:rPr>
-          <w:lang w:val="pl-PL"/>
-        </w:rPr>
-        <w:t>1. Kliknij przycisk „Konto”.</w:t>
-      </w:r>
-    </w:p>
-    <w:p>
-      <w:pPr>
-        <w:rPr>
-          <w:lang w:val="pl-PL"/>
-        </w:rPr>
-      </w:pPr>
-      <w:r>
-        <w:rPr>
-          <w:lang w:val="pl-PL"/>
-        </w:rPr>
-        <w:t>2. Wpisz poprawny adres e-mail.</w:t>
-      </w:r>
-    </w:p>
-    <w:p>
-      <w:pPr>
-        <w:rPr>
-          <w:lang w:val="pl-PL"/>
-        </w:rPr>
-      </w:pPr>
-      <w:r>
-        <w:rPr>
-          <w:lang w:val="pl-PL"/>
-        </w:rPr>
-        <w:t>3. Wpisz poprawne hasło.</w:t>
-      </w:r>
-    </w:p>
-    <w:p>
-      <w:pPr>
-        <w:rPr>
-          <w:lang w:val="pl-PL"/>
-        </w:rPr>
-      </w:pPr>
-      <w:r>
-        <w:rPr>
-          <w:lang w:val="pl-PL"/>
-        </w:rPr>
-        <w:t>4. Kliknij „Zaloguj się”.</w:t>
-      </w:r>
-    </w:p>
-    <w:p>
-      <w:pPr>
-        <w:rPr>
-          <w:lang w:val="pl-PL"/>
-        </w:rPr>
-      </w:pPr>
-      <w:r>
-        <w:rPr>
-          <w:lang w:val="pl-PL"/>
-        </w:rPr>
-        <w:t>Oczekiwany wynik: Użytkownik zostaje zalogowany i ma dostęp do panelu konta.</w:t>
-      </w:r>
-    </w:p>
-    <w:p>
-      <w:pPr>
-        <w:rPr>
-          <w:lang w:val="pl-PL"/>
-        </w:rPr>
-      </w:pPr>
-    </w:p>
-    <w:p>
-      <w:r>
-        <w:t>ID: TC_ECOMMERCE_LOGIN_WITH_INVALID_PASSWORD_VERIFY_ERROR_MESSAGE_DISPLAYED_012</w:t>
-      </w:r>
-    </w:p>
-    <w:p>
-      <w:pPr>
-        <w:rPr>
-          <w:lang w:val="pl-PL"/>
-        </w:rPr>
-      </w:pPr>
-      <w:r>
-        <w:rPr>
-          <w:lang w:val="pl-PL"/>
-        </w:rPr>
-        <w:t>Nazwa testu: Logowanie błędnym hasłem</w:t>
-      </w:r>
-    </w:p>
-    <w:p>
-      <w:pPr>
-        <w:rPr>
-          <w:lang w:val="pl-PL"/>
-        </w:rPr>
-      </w:pPr>
-      <w:r>
-        <w:rPr>
-          <w:lang w:val="pl-PL"/>
-        </w:rPr>
-        <w:t>Założenia: Użytkownik posiada konto w systemie.</w:t>
-      </w:r>
-    </w:p>
-    <w:p>
-      <w:pPr>
-        <w:rPr>
-          <w:lang w:val="pl-PL"/>
-        </w:rPr>
-      </w:pPr>
-      <w:r>
-        <w:rPr>
-          <w:lang w:val="pl-PL"/>
-        </w:rPr>
-        <w:t>Kroki wykonania:</w:t>
-      </w:r>
-    </w:p>
-    <w:p>
-      <w:pPr>
-        <w:rPr>
-          <w:lang w:val="pl-PL"/>
-        </w:rPr>
-      </w:pPr>
-      <w:r>
-        <w:rPr>
-          <w:lang w:val="pl-PL"/>
-        </w:rPr>
-        <w:t>1. Przejdź do strony logowania.</w:t>
-      </w:r>
-    </w:p>
-    <w:p>
-      <w:pPr>
-        <w:rPr>
-          <w:lang w:val="pl-PL"/>
-        </w:rPr>
-      </w:pPr>
-      <w:r>
-        <w:rPr>
-          <w:lang w:val="pl-PL"/>
-        </w:rPr>
-        <w:t>2. Wpisz poprawny e-mail.</w:t>
-      </w:r>
-    </w:p>
-    <w:p>
-      <w:pPr>
-        <w:rPr>
-          <w:lang w:val="pl-PL"/>
-        </w:rPr>
-      </w:pPr>
-      <w:r>
-        <w:rPr>
-          <w:lang w:val="pl-PL"/>
-        </w:rPr>
-        <w:t>3. Wpisz niepoprawne hasło.</w:t>
-      </w:r>
-    </w:p>
-    <w:p>
-      <w:pPr>
-        <w:rPr>
-          <w:lang w:val="pl-PL"/>
-        </w:rPr>
-      </w:pPr>
-      <w:r>
-        <w:rPr>
-          <w:lang w:val="pl-PL"/>
-        </w:rPr>
-        <w:t>4. Kliknij „Zaloguj się”.</w:t>
-      </w:r>
-    </w:p>
-    <w:p>
-      <w:pPr>
-        <w:rPr>
-          <w:lang w:val="pl-PL"/>
-        </w:rPr>
-      </w:pPr>
-      <w:r>
-        <w:rPr>
-          <w:lang w:val="pl-PL"/>
-        </w:rPr>
-        <w:t>Oczekiwany wynik: System wyświetla komunikat o błędnych danych logowania.</w:t>
-      </w:r>
-    </w:p>
-    <w:p>
-      <w:pPr>
-        <w:rPr>
-          <w:lang w:val="pl-PL"/>
-        </w:rPr>
-      </w:pPr>
-    </w:p>
-    <w:p>
-      <w:r>
-        <w:lastRenderedPageBreak/>
-        <w:t>ID: TC_ECOMMERCE_LOGIN_EMPTY_FIELDS_VALIDATION_VERIFY_LOGIN_FORM_VALIDATION_MESSAGES_013</w:t>
-      </w:r>
-    </w:p>
-    <w:p>
-      <w:pPr>
-        <w:rPr>
-          <w:lang w:val="pl-PL"/>
-        </w:rPr>
-      </w:pPr>
-      <w:r>
-        <w:rPr>
-          <w:lang w:val="pl-PL"/>
-        </w:rPr>
-        <w:t>Nazwa testu: Walidacja pustych pól logowania</w:t>
-      </w:r>
-    </w:p>
-    <w:p>
-      <w:pPr>
-        <w:rPr>
-          <w:lang w:val="pl-PL"/>
-        </w:rPr>
-      </w:pPr>
-      <w:r>
-        <w:rPr>
-          <w:lang w:val="pl-PL"/>
-        </w:rPr>
-        <w:t>Założenia: Użytkownik jest na stronie logowania.</w:t>
-      </w:r>
-    </w:p>
-    <w:p>
-      <w:pPr>
-        <w:rPr>
-          <w:lang w:val="pl-PL"/>
-        </w:rPr>
-      </w:pPr>
-      <w:r>
-        <w:rPr>
-          <w:lang w:val="pl-PL"/>
-        </w:rPr>
-        <w:t>Kroki wykonania:</w:t>
-      </w:r>
-    </w:p>
-    <w:p>
-      <w:pPr>
-        <w:rPr>
-          <w:lang w:val="pl-PL"/>
-        </w:rPr>
-      </w:pPr>
-      <w:r>
-        <w:rPr>
-          <w:lang w:val="pl-PL"/>
-        </w:rPr>
-        <w:t>1. Nie wpisuj żadnych danych w formularzu.</w:t>
-      </w:r>
-    </w:p>
-    <w:p>
-      <w:pPr>
-        <w:rPr>
-          <w:lang w:val="pl-PL"/>
-        </w:rPr>
-      </w:pPr>
-      <w:r>
-        <w:rPr>
-          <w:lang w:val="pl-PL"/>
-        </w:rPr>
-        <w:t>2. Kliknij przycisk „Zaloguj się”.</w:t>
-      </w:r>
-    </w:p>
-    <w:p>
-      <w:pPr>
-        <w:rPr>
-          <w:lang w:val="pl-PL"/>
-        </w:rPr>
-      </w:pPr>
-      <w:r>
-        <w:rPr>
-          <w:lang w:val="pl-PL"/>
-        </w:rPr>
-        <w:t>Oczekiwany wynik: System wyświetla komunikaty o wymaganych polach formularza.</w:t>
-      </w:r>
-    </w:p>
-    <w:p>
-      <w:pPr>
-        <w:rPr>
-          <w:lang w:val="pl-PL"/>
-        </w:rPr>
-      </w:pPr>
-    </w:p>
-    <w:p>
-      <w:r>
-        <w:t>ID: TC_ECOMMERCE_PASSWORD_RESET_LINK_NAVIGATION_VERIFY_PASSWORD_RESET_PAGE_LOAD_014</w:t>
-      </w:r>
-    </w:p>
-    <w:p>
-      <w:pPr>
-        <w:rPr>
-          <w:lang w:val="pl-PL"/>
-        </w:rPr>
-      </w:pPr>
-      <w:r>
-        <w:rPr>
-          <w:lang w:val="pl-PL"/>
-        </w:rPr>
-        <w:t>Nazwa testu: Przejście do odzyskiwania hasła</w:t>
-      </w:r>
-    </w:p>
-    <w:p>
-      <w:pPr>
-        <w:rPr>
-          <w:lang w:val="pl-PL"/>
-        </w:rPr>
-      </w:pPr>
-      <w:r>
-        <w:rPr>
-          <w:lang w:val="pl-PL"/>
-        </w:rPr>
-        <w:t>Założenia: Użytkownik znajduje się na stronie logowania.</w:t>
-      </w:r>
-    </w:p>
-    <w:p>
-      <w:pPr>
-        <w:rPr>
-          <w:lang w:val="pl-PL"/>
-        </w:rPr>
-      </w:pPr>
-      <w:r>
-        <w:rPr>
-          <w:lang w:val="pl-PL"/>
-        </w:rPr>
-        <w:t>Kroki wykonania:</w:t>
-      </w:r>
-    </w:p>
-    <w:p>
-      <w:pPr>
-        <w:rPr>
-          <w:lang w:val="pl-PL"/>
-        </w:rPr>
-      </w:pPr>
-      <w:r>
-        <w:rPr>
-          <w:lang w:val="pl-PL"/>
-        </w:rPr>
-        <w:t>1. Kliknij link „Nie pamiętasz hasła?”.</w:t>
-      </w:r>
-    </w:p>
-    <w:p>
-      <w:pPr>
-        <w:rPr>
-          <w:lang w:val="pl-PL"/>
-        </w:rPr>
-      </w:pPr>
-      <w:r>
-        <w:rPr>
-          <w:lang w:val="pl-PL"/>
-        </w:rPr>
-        <w:t>Oczekiwany wynik: Użytkownik zostaje przeniesiony na stronę resetowania hasła.</w:t>
-      </w:r>
-    </w:p>
-    <w:p>
-      <w:pPr>
-        <w:rPr>
-          <w:lang w:val="pl-PL"/>
-        </w:rPr>
-      </w:pPr>
-    </w:p>
-    <w:p>
-      <w:r>
-        <w:t>ID: TC_ECOMMERCE_ACCOUNT_ACCESS_WITHOUT_LOGIN_VERIFY_REDIRECT_TO_LOGIN_PAGE_015</w:t>
-      </w:r>
-    </w:p>
-    <w:p>
-      <w:pPr>
-        <w:rPr>
-          <w:lang w:val="pl-PL"/>
-        </w:rPr>
-      </w:pPr>
-      <w:r>
-        <w:rPr>
-          <w:lang w:val="pl-PL"/>
-        </w:rPr>
-        <w:t>Nazwa testu: Próba wejścia do konta bez logowania</w:t>
-      </w:r>
-    </w:p>
-    <w:p>
-      <w:pPr>
-        <w:rPr>
-          <w:lang w:val="pl-PL"/>
-        </w:rPr>
-      </w:pPr>
-      <w:r>
-        <w:rPr>
-          <w:lang w:val="pl-PL"/>
-        </w:rPr>
-        <w:t>Założenia: Użytkownik nie jest zalogowany.</w:t>
-      </w:r>
-    </w:p>
-    <w:p>
-      <w:pPr>
-        <w:rPr>
-          <w:lang w:val="pl-PL"/>
-        </w:rPr>
-      </w:pPr>
-      <w:r>
-        <w:rPr>
-          <w:lang w:val="pl-PL"/>
-        </w:rPr>
-        <w:t>Kroki wykonania:</w:t>
-      </w:r>
-    </w:p>
-    <w:p>
-      <w:pPr>
-        <w:rPr>
-          <w:lang w:val="pl-PL"/>
-        </w:rPr>
-      </w:pPr>
-      <w:r>
-        <w:rPr>
-          <w:lang w:val="pl-PL"/>
-        </w:rPr>
-        <w:t>1. Kliknij ikonę „Konto”.</w:t>
-      </w:r>
-    </w:p>
-    <w:p>
-      <w:pPr>
-        <w:rPr>
-          <w:lang w:val="pl-PL"/>
-        </w:rPr>
-      </w:pPr>
-      <w:r>
-        <w:rPr>
-          <w:lang w:val="pl-PL"/>
-        </w:rPr>
-        <w:t>Oczekiwany wynik: System przekierowuje użytkownika na stronę logowania.</w:t>
-      </w:r>
-    </w:p>
-    <w:p>
-      <w:pPr>
-        <w:rPr>
-          <w:lang w:val="pl-PL"/>
-        </w:rPr>
-      </w:pPr>
-    </w:p>
-    <w:p>
-      <w:r>
-        <w:lastRenderedPageBreak/>
-        <w:t>ID: TC_ECOMMERCE_ACCOUNT_FAVOURITES_ACCESS_WITHOUT_LOGIN_VERIFY_LOGIN_REQUIRED_016</w:t>
-      </w:r>
-    </w:p>
-    <w:p>
-      <w:pPr>
-        <w:rPr>
-          <w:lang w:val="pl-PL"/>
-        </w:rPr>
-      </w:pPr>
-      <w:r>
-        <w:rPr>
-          <w:lang w:val="pl-PL"/>
-        </w:rPr>
-        <w:t>Nazwa testu: Wejście w ulubione bez logowania</w:t>
-      </w:r>
-    </w:p>
-    <w:p>
-      <w:pPr>
-        <w:rPr>
-          <w:lang w:val="pl-PL"/>
-        </w:rPr>
-      </w:pPr>
-      <w:r>
-        <w:rPr>
-          <w:lang w:val="pl-PL"/>
-        </w:rPr>
-        <w:t>Założenia: Użytkownik nie jest zalogowany.</w:t>
-      </w:r>
-    </w:p>
-    <w:p>
-      <w:pPr>
-        <w:rPr>
-          <w:lang w:val="pl-PL"/>
-        </w:rPr>
-      </w:pPr>
-      <w:r>
-        <w:rPr>
-          <w:lang w:val="pl-PL"/>
-        </w:rPr>
-        <w:t>Kroki wykonania:</w:t>
-      </w:r>
-    </w:p>
-    <w:p>
-      <w:pPr>
-        <w:rPr>
-          <w:lang w:val="pl-PL"/>
-        </w:rPr>
-      </w:pPr>
-      <w:r>
-        <w:rPr>
-          <w:lang w:val="pl-PL"/>
-        </w:rPr>
-        <w:t>1. Kliknij sekcję „Ulubione”.</w:t>
-      </w:r>
-    </w:p>
-    <w:p>
-      <w:pPr>
-        <w:rPr>
-          <w:lang w:val="pl-PL"/>
-        </w:rPr>
-      </w:pPr>
-      <w:r>
-        <w:rPr>
-          <w:lang w:val="pl-PL"/>
-        </w:rPr>
-        <w:t>Oczekiwany wynik: System przekierowuje użytkownika na stronę logowania.</w:t>
-      </w:r>
-    </w:p>
-    <w:p>
-      <w:pPr>
-        <w:rPr>
-          <w:lang w:val="pl-PL"/>
-        </w:rPr>
-      </w:pPr>
-    </w:p>
-    <w:p>
-      <w:r>
-        <w:t>ID: TC_ECOMMERCE_CART_TOTAL_PRICE_UPDATE_AFTER_PRODUCT_REMOVAL_VERIFY_PRICE_RECALCULATION_017</w:t>
-      </w:r>
-    </w:p>
-    <w:p>
-      <w:pPr>
-        <w:rPr>
-          <w:lang w:val="pl-PL"/>
-        </w:rPr>
-      </w:pPr>
-      <w:r>
-        <w:rPr>
-          <w:lang w:val="pl-PL"/>
-        </w:rPr>
-        <w:t>Nazwa testu: Aktualizacja ceny koszyka po usunięciu produktu</w:t>
-      </w:r>
-    </w:p>
-    <w:p>
-      <w:pPr>
-        <w:rPr>
-          <w:lang w:val="pl-PL"/>
-        </w:rPr>
-      </w:pPr>
-      <w:r>
-        <w:rPr>
-          <w:lang w:val="pl-PL"/>
-        </w:rPr>
-        <w:t>Założenia: W koszyku znajdują się produkty.</w:t>
-      </w:r>
-    </w:p>
-    <w:p>
-      <w:pPr>
-        <w:rPr>
-          <w:lang w:val="pl-PL"/>
-        </w:rPr>
-      </w:pPr>
-      <w:r>
-        <w:rPr>
-          <w:lang w:val="pl-PL"/>
-        </w:rPr>
-        <w:t>Kroki wykonania:</w:t>
-      </w:r>
-    </w:p>
-    <w:p>
-      <w:pPr>
-        <w:rPr>
-          <w:lang w:val="pl-PL"/>
-        </w:rPr>
-      </w:pPr>
-      <w:r>
-        <w:rPr>
-          <w:lang w:val="pl-PL"/>
-        </w:rPr>
-        <w:t>1. Otwórz koszyk.</w:t>
-      </w:r>
-    </w:p>
-    <w:p>
-      <w:pPr>
-        <w:rPr>
-          <w:lang w:val="pl-PL"/>
-        </w:rPr>
-      </w:pPr>
-      <w:r>
-        <w:rPr>
-          <w:lang w:val="pl-PL"/>
-        </w:rPr>
-        <w:t>2. Zapamiętaj całkowitą cenę koszyka.</w:t>
-      </w:r>
-    </w:p>
-    <w:p>
-      <w:pPr>
-        <w:rPr>
-          <w:lang w:val="pl-PL"/>
-        </w:rPr>
-      </w:pPr>
-      <w:r>
-        <w:rPr>
-          <w:lang w:val="pl-PL"/>
-        </w:rPr>
-        <w:t>3. Usuń jeden produkt.</w:t>
-      </w:r>
-    </w:p>
-    <w:p>
-      <w:pPr>
-        <w:rPr>
-          <w:lang w:val="pl-PL"/>
-        </w:rPr>
-      </w:pPr>
-      <w:r>
-        <w:rPr>
-          <w:lang w:val="pl-PL"/>
-        </w:rPr>
-        <w:t>Oczekiwany wynik: Całkowita cena koszyka zostaje automatycznie przeliczona.</w:t>
-      </w:r>
-    </w:p>
-    <w:p>
-      <w:pPr>
-        <w:rPr>
-          <w:lang w:val="pl-PL"/>
-        </w:rPr>
-      </w:pPr>
-    </w:p>
-    <w:p>
-      <w:r>
-        <w:t>ID: TC_ECOMMERCE_CART_ICON_ITEM_COUNTER_UPDATE_AFTER_ADD_PRODUCT_018</w:t>
-      </w:r>
-    </w:p>
-    <w:p>
-      <w:pPr>
-        <w:rPr>
-          <w:lang w:val="pl-PL"/>
-        </w:rPr>
-      </w:pPr>
-      <w:r>
-        <w:rPr>
-          <w:lang w:val="pl-PL"/>
-        </w:rPr>
-        <w:t>Nazwa testu: Aktualizacja licznika koszyka</w:t>
-      </w:r>
-    </w:p>
-    <w:p>
-      <w:pPr>
-        <w:rPr>
-          <w:lang w:val="pl-PL"/>
-        </w:rPr>
-      </w:pPr>
-      <w:r>
-        <w:rPr>
-          <w:lang w:val="pl-PL"/>
-        </w:rPr>
-        <w:t>Założenia: Koszyk jest pusty.</w:t>
-      </w:r>
-    </w:p>
-    <w:p>
-      <w:pPr>
-        <w:rPr>
-          <w:lang w:val="pl-PL"/>
-        </w:rPr>
-      </w:pPr>
-      <w:r>
-        <w:rPr>
-          <w:lang w:val="pl-PL"/>
-        </w:rPr>
-        <w:t>Kroki wykonania:</w:t>
-      </w:r>
-    </w:p>
-    <w:p>
-      <w:pPr>
-        <w:rPr>
-          <w:lang w:val="pl-PL"/>
-        </w:rPr>
-      </w:pPr>
-      <w:r>
-        <w:rPr>
-          <w:lang w:val="pl-PL"/>
-        </w:rPr>
-        <w:t>1. Dodaj produkt do koszyka.</w:t>
-      </w:r>
-    </w:p>
-    <w:p>
-      <w:pPr>
-        <w:rPr>
-          <w:lang w:val="pl-PL"/>
-        </w:rPr>
-      </w:pPr>
-      <w:r>
-        <w:rPr>
-          <w:lang w:val="pl-PL"/>
-        </w:rPr>
-        <w:t>2. Sprawdź ikonę koszyka w nagłówku strony.</w:t>
-      </w:r>
-    </w:p>
-    <w:p>
-      <w:pPr>
-        <w:rPr>
-          <w:lang w:val="pl-PL"/>
-        </w:rPr>
-      </w:pPr>
-      <w:r>
-        <w:rPr>
-          <w:lang w:val="pl-PL"/>
-        </w:rPr>
-        <w:t>Oczekiwany wynik: Licznik koszyka zwiększa się o 1.</w:t>
-      </w:r>
-    </w:p>
-    <w:p>
-      <w:pPr>
-        <w:rPr>
-          <w:lang w:val="pl-PL"/>
-        </w:rPr>
-      </w:pPr>
-    </w:p>
-    <w:p>
-      <w:r>
-        <w:lastRenderedPageBreak/>
-        <w:t>ID: TC_ECOMMERCE_PRODUCT_PAGE_OPEN_VERIFY_PRODUCT_DETAILS_DISPLAYED_CORRECTLY_019</w:t>
-      </w:r>
-    </w:p>
-    <w:p>
-      <w:pPr>
-        <w:rPr>
-          <w:lang w:val="pl-PL"/>
-        </w:rPr>
-      </w:pPr>
-      <w:r>
-        <w:rPr>
-          <w:lang w:val="pl-PL"/>
-        </w:rPr>
-        <w:t>Nazwa testu: Otwarcie strony produktu</w:t>
-      </w:r>
-    </w:p>
-    <w:p>
-      <w:pPr>
-        <w:rPr>
-          <w:lang w:val="pl-PL"/>
-        </w:rPr>
-      </w:pPr>
-      <w:r>
-        <w:rPr>
-          <w:lang w:val="pl-PL"/>
-        </w:rPr>
-        <w:t>Założenia: Użytkownik znajduje się na stronie kategorii.</w:t>
-      </w:r>
-    </w:p>
-    <w:p>
-      <w:pPr>
-        <w:rPr>
-          <w:lang w:val="pl-PL"/>
-        </w:rPr>
-      </w:pPr>
-      <w:r>
-        <w:rPr>
-          <w:lang w:val="pl-PL"/>
-        </w:rPr>
-        <w:t>Kroki wykonania:</w:t>
-      </w:r>
-    </w:p>
-    <w:p>
-      <w:pPr>
-        <w:rPr>
-          <w:lang w:val="pl-PL"/>
-        </w:rPr>
-      </w:pPr>
-      <w:r>
-        <w:rPr>
-          <w:lang w:val="pl-PL"/>
-        </w:rPr>
         <w:t>1. Kliknij nazwę dowolnego produktu.</w:t>
       </w:r>
     </w:p>
@@ -1857,7 +1911,10 @@
     </w:p>
     <w:p>
       <w:r>
-        <w:t>ID: TC_ECOMMERCE_PRODUCT_ADD_TO_CART_FROM_PRODUCT_PAGE_VERIFY_CART_UPDATE_020</w:t>
+        <w:t xml:space="preserve">ID: </w:t>
+      </w:r>
+      <w:r>
+        <w:t>TC_PRODUCT_ADD_TO_CART_FROM_PAGE_020</w:t>
       </w:r>
     </w:p>
     <w:p>

</xml_diff>